<commit_message>
Remove sensitive genetic data, keep only folate/methylation variants
Strip variant table down to MTHFR C677T, MTHFR A1298C, and MTRR I22M
in both README and master document. Removed CFH, NOD2, ELAC2, TCF7L2,
MC1R, APOB, PTPN22, CYP2C19, TWNK, KIF1A — not relevant to the
folate pathway focus and unnecessarily personal.

Co-Authored-By: Claude Opus 4.6 (1M context) <noreply@anthropic.com>
</commit_message>
<xml_diff>
--- a/docs/MTHFR_Definitive_Master_Document.docx
+++ b/docs/MTHFR_Definitive_Master_Document.docx
@@ -2459,23 +2459,23 @@
               <w:bottom w:val="single" w:color="CCCCCC" w:sz="1"/>
               <w:right w:val="single" w:color="CCCCCC" w:sz="1"/>
             </w:tcBorders>
-            <w:shd w:fill="F2F2F2" w:val="clear"/>
-            <w:tcMar>
-              <w:top w:type="dxa" w:w="60"/>
-              <w:left w:type="dxa" w:w="100"/>
-              <w:bottom w:type="dxa" w:w="60"/>
-              <w:right w:type="dxa" w:w="100"/>
-            </w:tcMar>
-          </w:tcPr>
-          <w:p>
-            <w:r>
-              <w:rPr>
-                <w:rFonts w:ascii="Arial" w:cs="Arial" w:eastAsia="Arial" w:hAnsi="Arial"/>
-                <w:color w:val="333333"/>
-                <w:sz w:val="18"/>
-                <w:szCs w:val="18"/>
-              </w:rPr>
-              <w:t xml:space="preserve">CFH</w:t>
+            <w:shd w:fill="FFFFFF" w:val="clear"/>
+            <w:tcMar>
+              <w:top w:type="dxa" w:w="60"/>
+              <w:left w:type="dxa" w:w="100"/>
+              <w:bottom w:type="dxa" w:w="60"/>
+              <w:right w:type="dxa" w:w="100"/>
+            </w:tcMar>
+          </w:tcPr>
+          <w:p>
+            <w:r>
+              <w:rPr>
+                <w:rFonts w:ascii="Arial" w:cs="Arial" w:eastAsia="Arial" w:hAnsi="Arial"/>
+                <w:color w:val="333333"/>
+                <w:sz w:val="18"/>
+                <w:szCs w:val="18"/>
+              </w:rPr>
+              <w:t xml:space="preserve">MTRR</w:t>
             </w:r>
           </w:p>
         </w:tc>
@@ -2488,23 +2488,23 @@
               <w:bottom w:val="single" w:color="CCCCCC" w:sz="1"/>
               <w:right w:val="single" w:color="CCCCCC" w:sz="1"/>
             </w:tcBorders>
-            <w:shd w:fill="F2F2F2" w:val="clear"/>
-            <w:tcMar>
-              <w:top w:type="dxa" w:w="60"/>
-              <w:left w:type="dxa" w:w="100"/>
-              <w:bottom w:type="dxa" w:w="60"/>
-              <w:right w:type="dxa" w:w="100"/>
-            </w:tcMar>
-          </w:tcPr>
-          <w:p>
-            <w:r>
-              <w:rPr>
-                <w:rFonts w:ascii="Arial" w:cs="Arial" w:eastAsia="Arial" w:hAnsi="Arial"/>
-                <w:color w:val="333333"/>
-                <w:sz w:val="18"/>
-                <w:szCs w:val="18"/>
-              </w:rPr>
-              <w:t xml:space="preserve">His402= (c.1204C=)</w:t>
+            <w:shd w:fill="FFFFFF" w:val="clear"/>
+            <w:tcMar>
+              <w:top w:type="dxa" w:w="60"/>
+              <w:left w:type="dxa" w:w="100"/>
+              <w:bottom w:type="dxa" w:w="60"/>
+              <w:right w:type="dxa" w:w="100"/>
+            </w:tcMar>
+          </w:tcPr>
+          <w:p>
+            <w:r>
+              <w:rPr>
+                <w:rFonts w:ascii="Arial" w:cs="Arial" w:eastAsia="Arial" w:hAnsi="Arial"/>
+                <w:color w:val="333333"/>
+                <w:sz w:val="18"/>
+                <w:szCs w:val="18"/>
+              </w:rPr>
+              <w:t xml:space="preserve">I22M (c.66A&gt;G)</w:t>
             </w:r>
           </w:p>
         </w:tc>
@@ -2517,23 +2517,23 @@
               <w:bottom w:val="single" w:color="CCCCCC" w:sz="1"/>
               <w:right w:val="single" w:color="CCCCCC" w:sz="1"/>
             </w:tcBorders>
-            <w:shd w:fill="F2F2F2" w:val="clear"/>
-            <w:tcMar>
-              <w:top w:type="dxa" w:w="60"/>
-              <w:left w:type="dxa" w:w="100"/>
-              <w:bottom w:type="dxa" w:w="60"/>
-              <w:right w:type="dxa" w:w="100"/>
-            </w:tcMar>
-          </w:tcPr>
-          <w:p>
-            <w:r>
-              <w:rPr>
-                <w:rFonts w:ascii="Arial" w:cs="Arial" w:eastAsia="Arial" w:hAnsi="Arial"/>
-                <w:color w:val="333333"/>
-                <w:sz w:val="18"/>
-                <w:szCs w:val="18"/>
-              </w:rPr>
-              <w:t xml:space="preserve">rs1061170</w:t>
+            <w:shd w:fill="FFFFFF" w:val="clear"/>
+            <w:tcMar>
+              <w:top w:type="dxa" w:w="60"/>
+              <w:left w:type="dxa" w:w="100"/>
+              <w:bottom w:type="dxa" w:w="60"/>
+              <w:right w:type="dxa" w:w="100"/>
+            </w:tcMar>
+          </w:tcPr>
+          <w:p>
+            <w:r>
+              <w:rPr>
+                <w:rFonts w:ascii="Arial" w:cs="Arial" w:eastAsia="Arial" w:hAnsi="Arial"/>
+                <w:color w:val="333333"/>
+                <w:sz w:val="18"/>
+                <w:szCs w:val="18"/>
+              </w:rPr>
+              <w:t xml:space="preserve">rs1801394</w:t>
             </w:r>
           </w:p>
         </w:tc>
@@ -2546,23 +2546,23 @@
               <w:bottom w:val="single" w:color="CCCCCC" w:sz="1"/>
               <w:right w:val="single" w:color="CCCCCC" w:sz="1"/>
             </w:tcBorders>
-            <w:shd w:fill="F2F2F2" w:val="clear"/>
-            <w:tcMar>
-              <w:top w:type="dxa" w:w="60"/>
-              <w:left w:type="dxa" w:w="100"/>
-              <w:bottom w:type="dxa" w:w="60"/>
-              <w:right w:type="dxa" w:w="100"/>
-            </w:tcMar>
-          </w:tcPr>
-          <w:p>
-            <w:r>
-              <w:rPr>
-                <w:rFonts w:ascii="Arial" w:cs="Arial" w:eastAsia="Arial" w:hAnsi="Arial"/>
-                <w:color w:val="333333"/>
-                <w:sz w:val="18"/>
-                <w:szCs w:val="18"/>
-              </w:rPr>
-              <w:t xml:space="preserve">Hetero (TC)</w:t>
+            <w:shd w:fill="FFFFFF" w:val="clear"/>
+            <w:tcMar>
+              <w:top w:type="dxa" w:w="60"/>
+              <w:left w:type="dxa" w:w="100"/>
+              <w:bottom w:type="dxa" w:w="60"/>
+              <w:right w:type="dxa" w:w="100"/>
+            </w:tcMar>
+          </w:tcPr>
+          <w:p>
+            <w:r>
+              <w:rPr>
+                <w:rFonts w:ascii="Arial" w:cs="Arial" w:eastAsia="Arial" w:hAnsi="Arial"/>
+                <w:color w:val="333333"/>
+                <w:sz w:val="18"/>
+                <w:szCs w:val="18"/>
+              </w:rPr>
+              <w:t xml:space="preserve">Hetero (AG)</w:t>
             </w:r>
           </w:p>
         </w:tc>
@@ -2575,23 +2575,23 @@
               <w:bottom w:val="single" w:color="CCCCCC" w:sz="1"/>
               <w:right w:val="single" w:color="CCCCCC" w:sz="1"/>
             </w:tcBorders>
-            <w:shd w:fill="F2F2F2" w:val="clear"/>
-            <w:tcMar>
-              <w:top w:type="dxa" w:w="60"/>
-              <w:left w:type="dxa" w:w="100"/>
-              <w:bottom w:type="dxa" w:w="60"/>
-              <w:right w:type="dxa" w:w="100"/>
-            </w:tcMar>
-          </w:tcPr>
-          <w:p>
-            <w:r>
-              <w:rPr>
-                <w:rFonts w:ascii="Arial" w:cs="Arial" w:eastAsia="Arial" w:hAnsi="Arial"/>
-                <w:color w:val="333333"/>
-                <w:sz w:val="18"/>
-                <w:szCs w:val="18"/>
-              </w:rPr>
-              <w:t xml:space="preserve">Pathogenic, risk factor</w:t>
+            <w:shd w:fill="FFFFFF" w:val="clear"/>
+            <w:tcMar>
+              <w:top w:type="dxa" w:w="60"/>
+              <w:left w:type="dxa" w:w="100"/>
+              <w:bottom w:type="dxa" w:w="60"/>
+              <w:right w:type="dxa" w:w="100"/>
+            </w:tcMar>
+          </w:tcPr>
+          <w:p>
+            <w:r>
+              <w:rPr>
+                <w:rFonts w:ascii="Arial" w:cs="Arial" w:eastAsia="Arial" w:hAnsi="Arial"/>
+                <w:color w:val="333333"/>
+                <w:sz w:val="18"/>
+                <w:szCs w:val="18"/>
+              </w:rPr>
+              <w:t xml:space="preserve">Likely Pathogenic</w:t>
             </w:r>
           </w:p>
         </w:tc>
@@ -2604,37 +2604,6 @@
               <w:bottom w:val="single" w:color="CCCCCC" w:sz="1"/>
               <w:right w:val="single" w:color="CCCCCC" w:sz="1"/>
             </w:tcBorders>
-            <w:shd w:fill="F2F2F2" w:val="clear"/>
-            <w:tcMar>
-              <w:top w:type="dxa" w:w="60"/>
-              <w:left w:type="dxa" w:w="100"/>
-              <w:bottom w:type="dxa" w:w="60"/>
-              <w:right w:type="dxa" w:w="100"/>
-            </w:tcMar>
-          </w:tcPr>
-          <w:p>
-            <w:r>
-              <w:rPr>
-                <w:rFonts w:ascii="Arial" w:cs="Arial" w:eastAsia="Arial" w:hAnsi="Arial"/>
-                <w:color w:val="333333"/>
-                <w:sz w:val="18"/>
-                <w:szCs w:val="18"/>
-              </w:rPr>
-              <w:t xml:space="preserve">Vision / AMD</w:t>
-            </w:r>
-          </w:p>
-        </w:tc>
-      </w:tr>
-      <w:tr>
-        <w:tc>
-          <w:tcPr>
-            <w:tcW w:type="dxa" w:w="1100"/>
-            <w:tcBorders>
-              <w:top w:val="single" w:color="CCCCCC" w:sz="1"/>
-              <w:left w:val="single" w:color="CCCCCC" w:sz="1"/>
-              <w:bottom w:val="single" w:color="CCCCCC" w:sz="1"/>
-              <w:right w:val="single" w:color="CCCCCC" w:sz="1"/>
-            </w:tcBorders>
             <w:shd w:fill="FFFFFF" w:val="clear"/>
             <w:tcMar>
               <w:top w:type="dxa" w:w="60"/>
@@ -2651,1736 +2620,7 @@
                 <w:sz w:val="18"/>
                 <w:szCs w:val="18"/>
               </w:rPr>
-              <w:t xml:space="preserve">MTRR</w:t>
-            </w:r>
-          </w:p>
-        </w:tc>
-        <w:tc>
-          <w:tcPr>
-            <w:tcW w:type="dxa" w:w="1500"/>
-            <w:tcBorders>
-              <w:top w:val="single" w:color="CCCCCC" w:sz="1"/>
-              <w:left w:val="single" w:color="CCCCCC" w:sz="1"/>
-              <w:bottom w:val="single" w:color="CCCCCC" w:sz="1"/>
-              <w:right w:val="single" w:color="CCCCCC" w:sz="1"/>
-            </w:tcBorders>
-            <w:shd w:fill="FFFFFF" w:val="clear"/>
-            <w:tcMar>
-              <w:top w:type="dxa" w:w="60"/>
-              <w:left w:type="dxa" w:w="100"/>
-              <w:bottom w:type="dxa" w:w="60"/>
-              <w:right w:type="dxa" w:w="100"/>
-            </w:tcMar>
-          </w:tcPr>
-          <w:p>
-            <w:r>
-              <w:rPr>
-                <w:rFonts w:ascii="Arial" w:cs="Arial" w:eastAsia="Arial" w:hAnsi="Arial"/>
-                <w:color w:val="333333"/>
-                <w:sz w:val="18"/>
-                <w:szCs w:val="18"/>
-              </w:rPr>
-              <w:t xml:space="preserve">I22M (c.66A&gt;G)</w:t>
-            </w:r>
-          </w:p>
-        </w:tc>
-        <w:tc>
-          <w:tcPr>
-            <w:tcW w:type="dxa" w:w="1200"/>
-            <w:tcBorders>
-              <w:top w:val="single" w:color="CCCCCC" w:sz="1"/>
-              <w:left w:val="single" w:color="CCCCCC" w:sz="1"/>
-              <w:bottom w:val="single" w:color="CCCCCC" w:sz="1"/>
-              <w:right w:val="single" w:color="CCCCCC" w:sz="1"/>
-            </w:tcBorders>
-            <w:shd w:fill="FFFFFF" w:val="clear"/>
-            <w:tcMar>
-              <w:top w:type="dxa" w:w="60"/>
-              <w:left w:type="dxa" w:w="100"/>
-              <w:bottom w:type="dxa" w:w="60"/>
-              <w:right w:type="dxa" w:w="100"/>
-            </w:tcMar>
-          </w:tcPr>
-          <w:p>
-            <w:r>
-              <w:rPr>
-                <w:rFonts w:ascii="Arial" w:cs="Arial" w:eastAsia="Arial" w:hAnsi="Arial"/>
-                <w:color w:val="333333"/>
-                <w:sz w:val="18"/>
-                <w:szCs w:val="18"/>
-              </w:rPr>
-              <w:t xml:space="preserve">rs1801394</w:t>
-            </w:r>
-          </w:p>
-        </w:tc>
-        <w:tc>
-          <w:tcPr>
-            <w:tcW w:type="dxa" w:w="1100"/>
-            <w:tcBorders>
-              <w:top w:val="single" w:color="CCCCCC" w:sz="1"/>
-              <w:left w:val="single" w:color="CCCCCC" w:sz="1"/>
-              <w:bottom w:val="single" w:color="CCCCCC" w:sz="1"/>
-              <w:right w:val="single" w:color="CCCCCC" w:sz="1"/>
-            </w:tcBorders>
-            <w:shd w:fill="FFFFFF" w:val="clear"/>
-            <w:tcMar>
-              <w:top w:type="dxa" w:w="60"/>
-              <w:left w:type="dxa" w:w="100"/>
-              <w:bottom w:type="dxa" w:w="60"/>
-              <w:right w:type="dxa" w:w="100"/>
-            </w:tcMar>
-          </w:tcPr>
-          <w:p>
-            <w:r>
-              <w:rPr>
-                <w:rFonts w:ascii="Arial" w:cs="Arial" w:eastAsia="Arial" w:hAnsi="Arial"/>
-                <w:color w:val="333333"/>
-                <w:sz w:val="18"/>
-                <w:szCs w:val="18"/>
-              </w:rPr>
-              <w:t xml:space="preserve">Hetero (AG)</w:t>
-            </w:r>
-          </w:p>
-        </w:tc>
-        <w:tc>
-          <w:tcPr>
-            <w:tcW w:type="dxa" w:w="1560"/>
-            <w:tcBorders>
-              <w:top w:val="single" w:color="CCCCCC" w:sz="1"/>
-              <w:left w:val="single" w:color="CCCCCC" w:sz="1"/>
-              <w:bottom w:val="single" w:color="CCCCCC" w:sz="1"/>
-              <w:right w:val="single" w:color="CCCCCC" w:sz="1"/>
-            </w:tcBorders>
-            <w:shd w:fill="FFFFFF" w:val="clear"/>
-            <w:tcMar>
-              <w:top w:type="dxa" w:w="60"/>
-              <w:left w:type="dxa" w:w="100"/>
-              <w:bottom w:type="dxa" w:w="60"/>
-              <w:right w:type="dxa" w:w="100"/>
-            </w:tcMar>
-          </w:tcPr>
-          <w:p>
-            <w:r>
-              <w:rPr>
-                <w:rFonts w:ascii="Arial" w:cs="Arial" w:eastAsia="Arial" w:hAnsi="Arial"/>
-                <w:color w:val="333333"/>
-                <w:sz w:val="18"/>
-                <w:szCs w:val="18"/>
-              </w:rPr>
-              <w:t xml:space="preserve">Likely Pathogenic</w:t>
-            </w:r>
-          </w:p>
-        </w:tc>
-        <w:tc>
-          <w:tcPr>
-            <w:tcW w:type="dxa" w:w="2900"/>
-            <w:tcBorders>
-              <w:top w:val="single" w:color="CCCCCC" w:sz="1"/>
-              <w:left w:val="single" w:color="CCCCCC" w:sz="1"/>
-              <w:bottom w:val="single" w:color="CCCCCC" w:sz="1"/>
-              <w:right w:val="single" w:color="CCCCCC" w:sz="1"/>
-            </w:tcBorders>
-            <w:shd w:fill="FFFFFF" w:val="clear"/>
-            <w:tcMar>
-              <w:top w:type="dxa" w:w="60"/>
-              <w:left w:type="dxa" w:w="100"/>
-              <w:bottom w:type="dxa" w:w="60"/>
-              <w:right w:type="dxa" w:w="100"/>
-            </w:tcMar>
-          </w:tcPr>
-          <w:p>
-            <w:r>
-              <w:rPr>
-                <w:rFonts w:ascii="Arial" w:cs="Arial" w:eastAsia="Arial" w:hAnsi="Arial"/>
-                <w:color w:val="333333"/>
-                <w:sz w:val="18"/>
-                <w:szCs w:val="18"/>
-              </w:rPr>
               <w:t xml:space="preserve">B12 metabolism, methylation</w:t>
-            </w:r>
-          </w:p>
-        </w:tc>
-      </w:tr>
-      <w:tr>
-        <w:tc>
-          <w:tcPr>
-            <w:tcW w:type="dxa" w:w="1100"/>
-            <w:tcBorders>
-              <w:top w:val="single" w:color="CCCCCC" w:sz="1"/>
-              <w:left w:val="single" w:color="CCCCCC" w:sz="1"/>
-              <w:bottom w:val="single" w:color="CCCCCC" w:sz="1"/>
-              <w:right w:val="single" w:color="CCCCCC" w:sz="1"/>
-            </w:tcBorders>
-            <w:shd w:fill="F2F2F2" w:val="clear"/>
-            <w:tcMar>
-              <w:top w:type="dxa" w:w="60"/>
-              <w:left w:type="dxa" w:w="100"/>
-              <w:bottom w:type="dxa" w:w="60"/>
-              <w:right w:type="dxa" w:w="100"/>
-            </w:tcMar>
-          </w:tcPr>
-          <w:p>
-            <w:r>
-              <w:rPr>
-                <w:rFonts w:ascii="Arial" w:cs="Arial" w:eastAsia="Arial" w:hAnsi="Arial"/>
-                <w:color w:val="333333"/>
-                <w:sz w:val="18"/>
-                <w:szCs w:val="18"/>
-              </w:rPr>
-              <w:t xml:space="preserve">NOD2</w:t>
-            </w:r>
-          </w:p>
-        </w:tc>
-        <w:tc>
-          <w:tcPr>
-            <w:tcW w:type="dxa" w:w="1500"/>
-            <w:tcBorders>
-              <w:top w:val="single" w:color="CCCCCC" w:sz="1"/>
-              <w:left w:val="single" w:color="CCCCCC" w:sz="1"/>
-              <w:bottom w:val="single" w:color="CCCCCC" w:sz="1"/>
-              <w:right w:val="single" w:color="CCCCCC" w:sz="1"/>
-            </w:tcBorders>
-            <w:shd w:fill="F2F2F2" w:val="clear"/>
-            <w:tcMar>
-              <w:top w:type="dxa" w:w="60"/>
-              <w:left w:type="dxa" w:w="100"/>
-              <w:bottom w:type="dxa" w:w="60"/>
-              <w:right w:type="dxa" w:w="100"/>
-            </w:tcMar>
-          </w:tcPr>
-          <w:p>
-            <w:r>
-              <w:rPr>
-                <w:rFonts w:ascii="Arial" w:cs="Arial" w:eastAsia="Arial" w:hAnsi="Arial"/>
-                <w:color w:val="333333"/>
-                <w:sz w:val="18"/>
-                <w:szCs w:val="18"/>
-              </w:rPr>
-              <w:t xml:space="preserve">c.2798+158C&gt;T</w:t>
-            </w:r>
-          </w:p>
-        </w:tc>
-        <w:tc>
-          <w:tcPr>
-            <w:tcW w:type="dxa" w:w="1200"/>
-            <w:tcBorders>
-              <w:top w:val="single" w:color="CCCCCC" w:sz="1"/>
-              <w:left w:val="single" w:color="CCCCCC" w:sz="1"/>
-              <w:bottom w:val="single" w:color="CCCCCC" w:sz="1"/>
-              <w:right w:val="single" w:color="CCCCCC" w:sz="1"/>
-            </w:tcBorders>
-            <w:shd w:fill="F2F2F2" w:val="clear"/>
-            <w:tcMar>
-              <w:top w:type="dxa" w:w="60"/>
-              <w:left w:type="dxa" w:w="100"/>
-              <w:bottom w:type="dxa" w:w="60"/>
-              <w:right w:type="dxa" w:w="100"/>
-            </w:tcMar>
-          </w:tcPr>
-          <w:p>
-            <w:r>
-              <w:rPr>
-                <w:rFonts w:ascii="Arial" w:cs="Arial" w:eastAsia="Arial" w:hAnsi="Arial"/>
-                <w:color w:val="333333"/>
-                <w:sz w:val="18"/>
-                <w:szCs w:val="18"/>
-              </w:rPr>
-              <w:t xml:space="preserve">rs5743289</w:t>
-            </w:r>
-          </w:p>
-        </w:tc>
-        <w:tc>
-          <w:tcPr>
-            <w:tcW w:type="dxa" w:w="1100"/>
-            <w:tcBorders>
-              <w:top w:val="single" w:color="CCCCCC" w:sz="1"/>
-              <w:left w:val="single" w:color="CCCCCC" w:sz="1"/>
-              <w:bottom w:val="single" w:color="CCCCCC" w:sz="1"/>
-              <w:right w:val="single" w:color="CCCCCC" w:sz="1"/>
-            </w:tcBorders>
-            <w:shd w:fill="F2F2F2" w:val="clear"/>
-            <w:tcMar>
-              <w:top w:type="dxa" w:w="60"/>
-              <w:left w:type="dxa" w:w="100"/>
-              <w:bottom w:type="dxa" w:w="60"/>
-              <w:right w:type="dxa" w:w="100"/>
-            </w:tcMar>
-          </w:tcPr>
-          <w:p>
-            <w:r>
-              <w:rPr>
-                <w:rFonts w:ascii="Arial" w:cs="Arial" w:eastAsia="Arial" w:hAnsi="Arial"/>
-                <w:color w:val="333333"/>
-                <w:sz w:val="18"/>
-                <w:szCs w:val="18"/>
-              </w:rPr>
-              <w:t xml:space="preserve">Hetero (TC)</w:t>
-            </w:r>
-          </w:p>
-        </w:tc>
-        <w:tc>
-          <w:tcPr>
-            <w:tcW w:type="dxa" w:w="1560"/>
-            <w:tcBorders>
-              <w:top w:val="single" w:color="CCCCCC" w:sz="1"/>
-              <w:left w:val="single" w:color="CCCCCC" w:sz="1"/>
-              <w:bottom w:val="single" w:color="CCCCCC" w:sz="1"/>
-              <w:right w:val="single" w:color="CCCCCC" w:sz="1"/>
-            </w:tcBorders>
-            <w:shd w:fill="F2F2F2" w:val="clear"/>
-            <w:tcMar>
-              <w:top w:type="dxa" w:w="60"/>
-              <w:left w:type="dxa" w:w="100"/>
-              <w:bottom w:type="dxa" w:w="60"/>
-              <w:right w:type="dxa" w:w="100"/>
-            </w:tcMar>
-          </w:tcPr>
-          <w:p>
-            <w:r>
-              <w:rPr>
-                <w:rFonts w:ascii="Arial" w:cs="Arial" w:eastAsia="Arial" w:hAnsi="Arial"/>
-                <w:color w:val="333333"/>
-                <w:sz w:val="18"/>
-                <w:szCs w:val="18"/>
-              </w:rPr>
-              <w:t xml:space="preserve">Pathogenic</w:t>
-            </w:r>
-          </w:p>
-        </w:tc>
-        <w:tc>
-          <w:tcPr>
-            <w:tcW w:type="dxa" w:w="2900"/>
-            <w:tcBorders>
-              <w:top w:val="single" w:color="CCCCCC" w:sz="1"/>
-              <w:left w:val="single" w:color="CCCCCC" w:sz="1"/>
-              <w:bottom w:val="single" w:color="CCCCCC" w:sz="1"/>
-              <w:right w:val="single" w:color="CCCCCC" w:sz="1"/>
-            </w:tcBorders>
-            <w:shd w:fill="F2F2F2" w:val="clear"/>
-            <w:tcMar>
-              <w:top w:type="dxa" w:w="60"/>
-              <w:left w:type="dxa" w:w="100"/>
-              <w:bottom w:type="dxa" w:w="60"/>
-              <w:right w:type="dxa" w:w="100"/>
-            </w:tcMar>
-          </w:tcPr>
-          <w:p>
-            <w:r>
-              <w:rPr>
-                <w:rFonts w:ascii="Arial" w:cs="Arial" w:eastAsia="Arial" w:hAnsi="Arial"/>
-                <w:color w:val="333333"/>
-                <w:sz w:val="18"/>
-                <w:szCs w:val="18"/>
-              </w:rPr>
-              <w:t xml:space="preserve">Inflammation / Crohn’s</w:t>
-            </w:r>
-          </w:p>
-        </w:tc>
-      </w:tr>
-      <w:tr>
-        <w:tc>
-          <w:tcPr>
-            <w:tcW w:type="dxa" w:w="1100"/>
-            <w:tcBorders>
-              <w:top w:val="single" w:color="CCCCCC" w:sz="1"/>
-              <w:left w:val="single" w:color="CCCCCC" w:sz="1"/>
-              <w:bottom w:val="single" w:color="CCCCCC" w:sz="1"/>
-              <w:right w:val="single" w:color="CCCCCC" w:sz="1"/>
-            </w:tcBorders>
-            <w:shd w:fill="FFFFFF" w:val="clear"/>
-            <w:tcMar>
-              <w:top w:type="dxa" w:w="60"/>
-              <w:left w:type="dxa" w:w="100"/>
-              <w:bottom w:type="dxa" w:w="60"/>
-              <w:right w:type="dxa" w:w="100"/>
-            </w:tcMar>
-          </w:tcPr>
-          <w:p>
-            <w:r>
-              <w:rPr>
-                <w:rFonts w:ascii="Arial" w:cs="Arial" w:eastAsia="Arial" w:hAnsi="Arial"/>
-                <w:color w:val="333333"/>
-                <w:sz w:val="18"/>
-                <w:szCs w:val="18"/>
-              </w:rPr>
-              <w:t xml:space="preserve">ELAC2</w:t>
-            </w:r>
-          </w:p>
-        </w:tc>
-        <w:tc>
-          <w:tcPr>
-            <w:tcW w:type="dxa" w:w="1500"/>
-            <w:tcBorders>
-              <w:top w:val="single" w:color="CCCCCC" w:sz="1"/>
-              <w:left w:val="single" w:color="CCCCCC" w:sz="1"/>
-              <w:bottom w:val="single" w:color="CCCCCC" w:sz="1"/>
-              <w:right w:val="single" w:color="CCCCCC" w:sz="1"/>
-            </w:tcBorders>
-            <w:shd w:fill="FFFFFF" w:val="clear"/>
-            <w:tcMar>
-              <w:top w:type="dxa" w:w="60"/>
-              <w:left w:type="dxa" w:w="100"/>
-              <w:bottom w:type="dxa" w:w="60"/>
-              <w:right w:type="dxa" w:w="100"/>
-            </w:tcMar>
-          </w:tcPr>
-          <w:p>
-            <w:r>
-              <w:rPr>
-                <w:rFonts w:ascii="Arial" w:cs="Arial" w:eastAsia="Arial" w:hAnsi="Arial"/>
-                <w:color w:val="333333"/>
-                <w:sz w:val="18"/>
-                <w:szCs w:val="18"/>
-              </w:rPr>
-              <w:t xml:space="preserve">S217L</w:t>
-            </w:r>
-          </w:p>
-        </w:tc>
-        <w:tc>
-          <w:tcPr>
-            <w:tcW w:type="dxa" w:w="1200"/>
-            <w:tcBorders>
-              <w:top w:val="single" w:color="CCCCCC" w:sz="1"/>
-              <w:left w:val="single" w:color="CCCCCC" w:sz="1"/>
-              <w:bottom w:val="single" w:color="CCCCCC" w:sz="1"/>
-              <w:right w:val="single" w:color="CCCCCC" w:sz="1"/>
-            </w:tcBorders>
-            <w:shd w:fill="FFFFFF" w:val="clear"/>
-            <w:tcMar>
-              <w:top w:type="dxa" w:w="60"/>
-              <w:left w:type="dxa" w:w="100"/>
-              <w:bottom w:type="dxa" w:w="60"/>
-              <w:right w:type="dxa" w:w="100"/>
-            </w:tcMar>
-          </w:tcPr>
-          <w:p>
-            <w:r>
-              <w:rPr>
-                <w:rFonts w:ascii="Arial" w:cs="Arial" w:eastAsia="Arial" w:hAnsi="Arial"/>
-                <w:color w:val="333333"/>
-                <w:sz w:val="18"/>
-                <w:szCs w:val="18"/>
-              </w:rPr>
-              <w:t xml:space="preserve">rs4792311</w:t>
-            </w:r>
-          </w:p>
-        </w:tc>
-        <w:tc>
-          <w:tcPr>
-            <w:tcW w:type="dxa" w:w="1100"/>
-            <w:tcBorders>
-              <w:top w:val="single" w:color="CCCCCC" w:sz="1"/>
-              <w:left w:val="single" w:color="CCCCCC" w:sz="1"/>
-              <w:bottom w:val="single" w:color="CCCCCC" w:sz="1"/>
-              <w:right w:val="single" w:color="CCCCCC" w:sz="1"/>
-            </w:tcBorders>
-            <w:shd w:fill="FFFFFF" w:val="clear"/>
-            <w:tcMar>
-              <w:top w:type="dxa" w:w="60"/>
-              <w:left w:type="dxa" w:w="100"/>
-              <w:bottom w:type="dxa" w:w="60"/>
-              <w:right w:type="dxa" w:w="100"/>
-            </w:tcMar>
-          </w:tcPr>
-          <w:p>
-            <w:r>
-              <w:rPr>
-                <w:rFonts w:ascii="Arial" w:cs="Arial" w:eastAsia="Arial" w:hAnsi="Arial"/>
-                <w:color w:val="333333"/>
-                <w:sz w:val="18"/>
-                <w:szCs w:val="18"/>
-              </w:rPr>
-              <w:t xml:space="preserve">Homo (AA)</w:t>
-            </w:r>
-          </w:p>
-        </w:tc>
-        <w:tc>
-          <w:tcPr>
-            <w:tcW w:type="dxa" w:w="1560"/>
-            <w:tcBorders>
-              <w:top w:val="single" w:color="CCCCCC" w:sz="1"/>
-              <w:left w:val="single" w:color="CCCCCC" w:sz="1"/>
-              <w:bottom w:val="single" w:color="CCCCCC" w:sz="1"/>
-              <w:right w:val="single" w:color="CCCCCC" w:sz="1"/>
-            </w:tcBorders>
-            <w:shd w:fill="FFFFFF" w:val="clear"/>
-            <w:tcMar>
-              <w:top w:type="dxa" w:w="60"/>
-              <w:left w:type="dxa" w:w="100"/>
-              <w:bottom w:type="dxa" w:w="60"/>
-              <w:right w:type="dxa" w:w="100"/>
-            </w:tcMar>
-          </w:tcPr>
-          <w:p>
-            <w:r>
-              <w:rPr>
-                <w:rFonts w:ascii="Arial" w:cs="Arial" w:eastAsia="Arial" w:hAnsi="Arial"/>
-                <w:color w:val="333333"/>
-                <w:sz w:val="18"/>
-                <w:szCs w:val="18"/>
-              </w:rPr>
-              <w:t xml:space="preserve">Uncertain Pathogenic</w:t>
-            </w:r>
-          </w:p>
-        </w:tc>
-        <w:tc>
-          <w:tcPr>
-            <w:tcW w:type="dxa" w:w="2900"/>
-            <w:tcBorders>
-              <w:top w:val="single" w:color="CCCCCC" w:sz="1"/>
-              <w:left w:val="single" w:color="CCCCCC" w:sz="1"/>
-              <w:bottom w:val="single" w:color="CCCCCC" w:sz="1"/>
-              <w:right w:val="single" w:color="CCCCCC" w:sz="1"/>
-            </w:tcBorders>
-            <w:shd w:fill="FFFFFF" w:val="clear"/>
-            <w:tcMar>
-              <w:top w:type="dxa" w:w="60"/>
-              <w:left w:type="dxa" w:w="100"/>
-              <w:bottom w:type="dxa" w:w="60"/>
-              <w:right w:type="dxa" w:w="100"/>
-            </w:tcMar>
-          </w:tcPr>
-          <w:p>
-            <w:r>
-              <w:rPr>
-                <w:rFonts w:ascii="Arial" w:cs="Arial" w:eastAsia="Arial" w:hAnsi="Arial"/>
-                <w:color w:val="333333"/>
-                <w:sz w:val="18"/>
-                <w:szCs w:val="18"/>
-              </w:rPr>
-              <w:t xml:space="preserve">Prostate cancer risk</w:t>
-            </w:r>
-          </w:p>
-        </w:tc>
-      </w:tr>
-      <w:tr>
-        <w:tc>
-          <w:tcPr>
-            <w:tcW w:type="dxa" w:w="1100"/>
-            <w:tcBorders>
-              <w:top w:val="single" w:color="CCCCCC" w:sz="1"/>
-              <w:left w:val="single" w:color="CCCCCC" w:sz="1"/>
-              <w:bottom w:val="single" w:color="CCCCCC" w:sz="1"/>
-              <w:right w:val="single" w:color="CCCCCC" w:sz="1"/>
-            </w:tcBorders>
-            <w:shd w:fill="F2F2F2" w:val="clear"/>
-            <w:tcMar>
-              <w:top w:type="dxa" w:w="60"/>
-              <w:left w:type="dxa" w:w="100"/>
-              <w:bottom w:type="dxa" w:w="60"/>
-              <w:right w:type="dxa" w:w="100"/>
-            </w:tcMar>
-          </w:tcPr>
-          <w:p>
-            <w:r>
-              <w:rPr>
-                <w:rFonts w:ascii="Arial" w:cs="Arial" w:eastAsia="Arial" w:hAnsi="Arial"/>
-                <w:color w:val="333333"/>
-                <w:sz w:val="18"/>
-                <w:szCs w:val="18"/>
-              </w:rPr>
-              <w:t xml:space="preserve">TCF7L2</w:t>
-            </w:r>
-          </w:p>
-        </w:tc>
-        <w:tc>
-          <w:tcPr>
-            <w:tcW w:type="dxa" w:w="1500"/>
-            <w:tcBorders>
-              <w:top w:val="single" w:color="CCCCCC" w:sz="1"/>
-              <w:left w:val="single" w:color="CCCCCC" w:sz="1"/>
-              <w:bottom w:val="single" w:color="CCCCCC" w:sz="1"/>
-              <w:right w:val="single" w:color="CCCCCC" w:sz="1"/>
-            </w:tcBorders>
-            <w:shd w:fill="F2F2F2" w:val="clear"/>
-            <w:tcMar>
-              <w:top w:type="dxa" w:w="60"/>
-              <w:left w:type="dxa" w:w="100"/>
-              <w:bottom w:type="dxa" w:w="60"/>
-              <w:right w:type="dxa" w:w="100"/>
-            </w:tcMar>
-          </w:tcPr>
-          <w:p>
-            <w:r>
-              <w:rPr>
-                <w:rFonts w:ascii="Arial" w:cs="Arial" w:eastAsia="Arial" w:hAnsi="Arial"/>
-                <w:color w:val="333333"/>
-                <w:sz w:val="18"/>
-                <w:szCs w:val="18"/>
-              </w:rPr>
-              <w:t xml:space="preserve">c.382-41435C&gt;T</w:t>
-            </w:r>
-          </w:p>
-        </w:tc>
-        <w:tc>
-          <w:tcPr>
-            <w:tcW w:type="dxa" w:w="1200"/>
-            <w:tcBorders>
-              <w:top w:val="single" w:color="CCCCCC" w:sz="1"/>
-              <w:left w:val="single" w:color="CCCCCC" w:sz="1"/>
-              <w:bottom w:val="single" w:color="CCCCCC" w:sz="1"/>
-              <w:right w:val="single" w:color="CCCCCC" w:sz="1"/>
-            </w:tcBorders>
-            <w:shd w:fill="F2F2F2" w:val="clear"/>
-            <w:tcMar>
-              <w:top w:type="dxa" w:w="60"/>
-              <w:left w:type="dxa" w:w="100"/>
-              <w:bottom w:type="dxa" w:w="60"/>
-              <w:right w:type="dxa" w:w="100"/>
-            </w:tcMar>
-          </w:tcPr>
-          <w:p>
-            <w:r>
-              <w:rPr>
-                <w:rFonts w:ascii="Arial" w:cs="Arial" w:eastAsia="Arial" w:hAnsi="Arial"/>
-                <w:color w:val="333333"/>
-                <w:sz w:val="18"/>
-                <w:szCs w:val="18"/>
-              </w:rPr>
-              <w:t xml:space="preserve">rs7903146</w:t>
-            </w:r>
-          </w:p>
-        </w:tc>
-        <w:tc>
-          <w:tcPr>
-            <w:tcW w:type="dxa" w:w="1100"/>
-            <w:tcBorders>
-              <w:top w:val="single" w:color="CCCCCC" w:sz="1"/>
-              <w:left w:val="single" w:color="CCCCCC" w:sz="1"/>
-              <w:bottom w:val="single" w:color="CCCCCC" w:sz="1"/>
-              <w:right w:val="single" w:color="CCCCCC" w:sz="1"/>
-            </w:tcBorders>
-            <w:shd w:fill="F2F2F2" w:val="clear"/>
-            <w:tcMar>
-              <w:top w:type="dxa" w:w="60"/>
-              <w:left w:type="dxa" w:w="100"/>
-              <w:bottom w:type="dxa" w:w="60"/>
-              <w:right w:type="dxa" w:w="100"/>
-            </w:tcMar>
-          </w:tcPr>
-          <w:p>
-            <w:r>
-              <w:rPr>
-                <w:rFonts w:ascii="Arial" w:cs="Arial" w:eastAsia="Arial" w:hAnsi="Arial"/>
-                <w:color w:val="333333"/>
-                <w:sz w:val="18"/>
-                <w:szCs w:val="18"/>
-              </w:rPr>
-              <w:t xml:space="preserve">Homo (TT)</w:t>
-            </w:r>
-          </w:p>
-        </w:tc>
-        <w:tc>
-          <w:tcPr>
-            <w:tcW w:type="dxa" w:w="1560"/>
-            <w:tcBorders>
-              <w:top w:val="single" w:color="CCCCCC" w:sz="1"/>
-              <w:left w:val="single" w:color="CCCCCC" w:sz="1"/>
-              <w:bottom w:val="single" w:color="CCCCCC" w:sz="1"/>
-              <w:right w:val="single" w:color="CCCCCC" w:sz="1"/>
-            </w:tcBorders>
-            <w:shd w:fill="F2F2F2" w:val="clear"/>
-            <w:tcMar>
-              <w:top w:type="dxa" w:w="60"/>
-              <w:left w:type="dxa" w:w="100"/>
-              <w:bottom w:type="dxa" w:w="60"/>
-              <w:right w:type="dxa" w:w="100"/>
-            </w:tcMar>
-          </w:tcPr>
-          <w:p>
-            <w:r>
-              <w:rPr>
-                <w:rFonts w:ascii="Arial" w:cs="Arial" w:eastAsia="Arial" w:hAnsi="Arial"/>
-                <w:color w:val="333333"/>
-                <w:sz w:val="18"/>
-                <w:szCs w:val="18"/>
-              </w:rPr>
-              <w:t xml:space="preserve">Pathogenic</w:t>
-            </w:r>
-          </w:p>
-        </w:tc>
-        <w:tc>
-          <w:tcPr>
-            <w:tcW w:type="dxa" w:w="2900"/>
-            <w:tcBorders>
-              <w:top w:val="single" w:color="CCCCCC" w:sz="1"/>
-              <w:left w:val="single" w:color="CCCCCC" w:sz="1"/>
-              <w:bottom w:val="single" w:color="CCCCCC" w:sz="1"/>
-              <w:right w:val="single" w:color="CCCCCC" w:sz="1"/>
-            </w:tcBorders>
-            <w:shd w:fill="F2F2F2" w:val="clear"/>
-            <w:tcMar>
-              <w:top w:type="dxa" w:w="60"/>
-              <w:left w:type="dxa" w:w="100"/>
-              <w:bottom w:type="dxa" w:w="60"/>
-              <w:right w:type="dxa" w:w="100"/>
-            </w:tcMar>
-          </w:tcPr>
-          <w:p>
-            <w:r>
-              <w:rPr>
-                <w:rFonts w:ascii="Arial" w:cs="Arial" w:eastAsia="Arial" w:hAnsi="Arial"/>
-                <w:color w:val="333333"/>
-                <w:sz w:val="18"/>
-                <w:szCs w:val="18"/>
-              </w:rPr>
-              <w:t xml:space="preserve">Type 2 diabetes → retinopathy</w:t>
-            </w:r>
-          </w:p>
-        </w:tc>
-      </w:tr>
-      <w:tr>
-        <w:tc>
-          <w:tcPr>
-            <w:tcW w:type="dxa" w:w="1100"/>
-            <w:tcBorders>
-              <w:top w:val="single" w:color="CCCCCC" w:sz="1"/>
-              <w:left w:val="single" w:color="CCCCCC" w:sz="1"/>
-              <w:bottom w:val="single" w:color="CCCCCC" w:sz="1"/>
-              <w:right w:val="single" w:color="CCCCCC" w:sz="1"/>
-            </w:tcBorders>
-            <w:shd w:fill="FFFFFF" w:val="clear"/>
-            <w:tcMar>
-              <w:top w:type="dxa" w:w="60"/>
-              <w:left w:type="dxa" w:w="100"/>
-              <w:bottom w:type="dxa" w:w="60"/>
-              <w:right w:type="dxa" w:w="100"/>
-            </w:tcMar>
-          </w:tcPr>
-          <w:p>
-            <w:r>
-              <w:rPr>
-                <w:rFonts w:ascii="Arial" w:cs="Arial" w:eastAsia="Arial" w:hAnsi="Arial"/>
-                <w:color w:val="333333"/>
-                <w:sz w:val="18"/>
-                <w:szCs w:val="18"/>
-              </w:rPr>
-              <w:t xml:space="preserve">MC1R</w:t>
-            </w:r>
-          </w:p>
-        </w:tc>
-        <w:tc>
-          <w:tcPr>
-            <w:tcW w:type="dxa" w:w="1500"/>
-            <w:tcBorders>
-              <w:top w:val="single" w:color="CCCCCC" w:sz="1"/>
-              <w:left w:val="single" w:color="CCCCCC" w:sz="1"/>
-              <w:bottom w:val="single" w:color="CCCCCC" w:sz="1"/>
-              <w:right w:val="single" w:color="CCCCCC" w:sz="1"/>
-            </w:tcBorders>
-            <w:shd w:fill="FFFFFF" w:val="clear"/>
-            <w:tcMar>
-              <w:top w:type="dxa" w:w="60"/>
-              <w:left w:type="dxa" w:w="100"/>
-              <w:bottom w:type="dxa" w:w="60"/>
-              <w:right w:type="dxa" w:w="100"/>
-            </w:tcMar>
-          </w:tcPr>
-          <w:p>
-            <w:r>
-              <w:rPr>
-                <w:rFonts w:ascii="Arial" w:cs="Arial" w:eastAsia="Arial" w:hAnsi="Arial"/>
-                <w:color w:val="333333"/>
-                <w:sz w:val="18"/>
-                <w:szCs w:val="18"/>
-              </w:rPr>
-              <w:t xml:space="preserve">R151C (c.451C&gt;T)</w:t>
-            </w:r>
-          </w:p>
-        </w:tc>
-        <w:tc>
-          <w:tcPr>
-            <w:tcW w:type="dxa" w:w="1200"/>
-            <w:tcBorders>
-              <w:top w:val="single" w:color="CCCCCC" w:sz="1"/>
-              <w:left w:val="single" w:color="CCCCCC" w:sz="1"/>
-              <w:bottom w:val="single" w:color="CCCCCC" w:sz="1"/>
-              <w:right w:val="single" w:color="CCCCCC" w:sz="1"/>
-            </w:tcBorders>
-            <w:shd w:fill="FFFFFF" w:val="clear"/>
-            <w:tcMar>
-              <w:top w:type="dxa" w:w="60"/>
-              <w:left w:type="dxa" w:w="100"/>
-              <w:bottom w:type="dxa" w:w="60"/>
-              <w:right w:type="dxa" w:w="100"/>
-            </w:tcMar>
-          </w:tcPr>
-          <w:p>
-            <w:r>
-              <w:rPr>
-                <w:rFonts w:ascii="Arial" w:cs="Arial" w:eastAsia="Arial" w:hAnsi="Arial"/>
-                <w:color w:val="333333"/>
-                <w:sz w:val="18"/>
-                <w:szCs w:val="18"/>
-              </w:rPr>
-              <w:t xml:space="preserve">rs1805007</w:t>
-            </w:r>
-          </w:p>
-        </w:tc>
-        <w:tc>
-          <w:tcPr>
-            <w:tcW w:type="dxa" w:w="1100"/>
-            <w:tcBorders>
-              <w:top w:val="single" w:color="CCCCCC" w:sz="1"/>
-              <w:left w:val="single" w:color="CCCCCC" w:sz="1"/>
-              <w:bottom w:val="single" w:color="CCCCCC" w:sz="1"/>
-              <w:right w:val="single" w:color="CCCCCC" w:sz="1"/>
-            </w:tcBorders>
-            <w:shd w:fill="FFFFFF" w:val="clear"/>
-            <w:tcMar>
-              <w:top w:type="dxa" w:w="60"/>
-              <w:left w:type="dxa" w:w="100"/>
-              <w:bottom w:type="dxa" w:w="60"/>
-              <w:right w:type="dxa" w:w="100"/>
-            </w:tcMar>
-          </w:tcPr>
-          <w:p>
-            <w:r>
-              <w:rPr>
-                <w:rFonts w:ascii="Arial" w:cs="Arial" w:eastAsia="Arial" w:hAnsi="Arial"/>
-                <w:color w:val="333333"/>
-                <w:sz w:val="18"/>
-                <w:szCs w:val="18"/>
-              </w:rPr>
-              <w:t xml:space="preserve">Hetero (TC)</w:t>
-            </w:r>
-          </w:p>
-        </w:tc>
-        <w:tc>
-          <w:tcPr>
-            <w:tcW w:type="dxa" w:w="1560"/>
-            <w:tcBorders>
-              <w:top w:val="single" w:color="CCCCCC" w:sz="1"/>
-              <w:left w:val="single" w:color="CCCCCC" w:sz="1"/>
-              <w:bottom w:val="single" w:color="CCCCCC" w:sz="1"/>
-              <w:right w:val="single" w:color="CCCCCC" w:sz="1"/>
-            </w:tcBorders>
-            <w:shd w:fill="FFFFFF" w:val="clear"/>
-            <w:tcMar>
-              <w:top w:type="dxa" w:w="60"/>
-              <w:left w:type="dxa" w:w="100"/>
-              <w:bottom w:type="dxa" w:w="60"/>
-              <w:right w:type="dxa" w:w="100"/>
-            </w:tcMar>
-          </w:tcPr>
-          <w:p>
-            <w:r>
-              <w:rPr>
-                <w:rFonts w:ascii="Arial" w:cs="Arial" w:eastAsia="Arial" w:hAnsi="Arial"/>
-                <w:color w:val="333333"/>
-                <w:sz w:val="18"/>
-                <w:szCs w:val="18"/>
-              </w:rPr>
-              <w:t xml:space="preserve">Conflicting</w:t>
-            </w:r>
-          </w:p>
-        </w:tc>
-        <w:tc>
-          <w:tcPr>
-            <w:tcW w:type="dxa" w:w="2900"/>
-            <w:tcBorders>
-              <w:top w:val="single" w:color="CCCCCC" w:sz="1"/>
-              <w:left w:val="single" w:color="CCCCCC" w:sz="1"/>
-              <w:bottom w:val="single" w:color="CCCCCC" w:sz="1"/>
-              <w:right w:val="single" w:color="CCCCCC" w:sz="1"/>
-            </w:tcBorders>
-            <w:shd w:fill="FFFFFF" w:val="clear"/>
-            <w:tcMar>
-              <w:top w:type="dxa" w:w="60"/>
-              <w:left w:type="dxa" w:w="100"/>
-              <w:bottom w:type="dxa" w:w="60"/>
-              <w:right w:type="dxa" w:w="100"/>
-            </w:tcMar>
-          </w:tcPr>
-          <w:p>
-            <w:r>
-              <w:rPr>
-                <w:rFonts w:ascii="Arial" w:cs="Arial" w:eastAsia="Arial" w:hAnsi="Arial"/>
-                <w:color w:val="333333"/>
-                <w:sz w:val="18"/>
-                <w:szCs w:val="18"/>
-              </w:rPr>
-              <w:t xml:space="preserve">UV/melanoma susceptibility</w:t>
-            </w:r>
-          </w:p>
-        </w:tc>
-      </w:tr>
-      <w:tr>
-        <w:tc>
-          <w:tcPr>
-            <w:tcW w:type="dxa" w:w="1100"/>
-            <w:tcBorders>
-              <w:top w:val="single" w:color="CCCCCC" w:sz="1"/>
-              <w:left w:val="single" w:color="CCCCCC" w:sz="1"/>
-              <w:bottom w:val="single" w:color="CCCCCC" w:sz="1"/>
-              <w:right w:val="single" w:color="CCCCCC" w:sz="1"/>
-            </w:tcBorders>
-            <w:shd w:fill="F2F2F2" w:val="clear"/>
-            <w:tcMar>
-              <w:top w:type="dxa" w:w="60"/>
-              <w:left w:type="dxa" w:w="100"/>
-              <w:bottom w:type="dxa" w:w="60"/>
-              <w:right w:type="dxa" w:w="100"/>
-            </w:tcMar>
-          </w:tcPr>
-          <w:p>
-            <w:r>
-              <w:rPr>
-                <w:rFonts w:ascii="Arial" w:cs="Arial" w:eastAsia="Arial" w:hAnsi="Arial"/>
-                <w:color w:val="333333"/>
-                <w:sz w:val="18"/>
-                <w:szCs w:val="18"/>
-              </w:rPr>
-              <w:t xml:space="preserve">APOB</w:t>
-            </w:r>
-          </w:p>
-        </w:tc>
-        <w:tc>
-          <w:tcPr>
-            <w:tcW w:type="dxa" w:w="1500"/>
-            <w:tcBorders>
-              <w:top w:val="single" w:color="CCCCCC" w:sz="1"/>
-              <w:left w:val="single" w:color="CCCCCC" w:sz="1"/>
-              <w:bottom w:val="single" w:color="CCCCCC" w:sz="1"/>
-              <w:right w:val="single" w:color="CCCCCC" w:sz="1"/>
-            </w:tcBorders>
-            <w:shd w:fill="F2F2F2" w:val="clear"/>
-            <w:tcMar>
-              <w:top w:type="dxa" w:w="60"/>
-              <w:left w:type="dxa" w:w="100"/>
-              <w:bottom w:type="dxa" w:w="60"/>
-              <w:right w:type="dxa" w:w="100"/>
-            </w:tcMar>
-          </w:tcPr>
-          <w:p>
-            <w:r>
-              <w:rPr>
-                <w:rFonts w:ascii="Arial" w:cs="Arial" w:eastAsia="Arial" w:hAnsi="Arial"/>
-                <w:color w:val="333333"/>
-                <w:sz w:val="18"/>
-                <w:szCs w:val="18"/>
-              </w:rPr>
-              <w:t xml:space="preserve">V730I</w:t>
-            </w:r>
-          </w:p>
-        </w:tc>
-        <w:tc>
-          <w:tcPr>
-            <w:tcW w:type="dxa" w:w="1200"/>
-            <w:tcBorders>
-              <w:top w:val="single" w:color="CCCCCC" w:sz="1"/>
-              <w:left w:val="single" w:color="CCCCCC" w:sz="1"/>
-              <w:bottom w:val="single" w:color="CCCCCC" w:sz="1"/>
-              <w:right w:val="single" w:color="CCCCCC" w:sz="1"/>
-            </w:tcBorders>
-            <w:shd w:fill="F2F2F2" w:val="clear"/>
-            <w:tcMar>
-              <w:top w:type="dxa" w:w="60"/>
-              <w:left w:type="dxa" w:w="100"/>
-              <w:bottom w:type="dxa" w:w="60"/>
-              <w:right w:type="dxa" w:w="100"/>
-            </w:tcMar>
-          </w:tcPr>
-          <w:p>
-            <w:r>
-              <w:rPr>
-                <w:rFonts w:ascii="Arial" w:cs="Arial" w:eastAsia="Arial" w:hAnsi="Arial"/>
-                <w:color w:val="333333"/>
-                <w:sz w:val="18"/>
-                <w:szCs w:val="18"/>
-              </w:rPr>
-              <w:t xml:space="preserve">rs12691202</w:t>
-            </w:r>
-          </w:p>
-        </w:tc>
-        <w:tc>
-          <w:tcPr>
-            <w:tcW w:type="dxa" w:w="1100"/>
-            <w:tcBorders>
-              <w:top w:val="single" w:color="CCCCCC" w:sz="1"/>
-              <w:left w:val="single" w:color="CCCCCC" w:sz="1"/>
-              <w:bottom w:val="single" w:color="CCCCCC" w:sz="1"/>
-              <w:right w:val="single" w:color="CCCCCC" w:sz="1"/>
-            </w:tcBorders>
-            <w:shd w:fill="F2F2F2" w:val="clear"/>
-            <w:tcMar>
-              <w:top w:type="dxa" w:w="60"/>
-              <w:left w:type="dxa" w:w="100"/>
-              <w:bottom w:type="dxa" w:w="60"/>
-              <w:right w:type="dxa" w:w="100"/>
-            </w:tcMar>
-          </w:tcPr>
-          <w:p>
-            <w:r>
-              <w:rPr>
-                <w:rFonts w:ascii="Arial" w:cs="Arial" w:eastAsia="Arial" w:hAnsi="Arial"/>
-                <w:color w:val="333333"/>
-                <w:sz w:val="18"/>
-                <w:szCs w:val="18"/>
-              </w:rPr>
-              <w:t xml:space="preserve">Hetero (TC)</w:t>
-            </w:r>
-          </w:p>
-        </w:tc>
-        <w:tc>
-          <w:tcPr>
-            <w:tcW w:type="dxa" w:w="1560"/>
-            <w:tcBorders>
-              <w:top w:val="single" w:color="CCCCCC" w:sz="1"/>
-              <w:left w:val="single" w:color="CCCCCC" w:sz="1"/>
-              <w:bottom w:val="single" w:color="CCCCCC" w:sz="1"/>
-              <w:right w:val="single" w:color="CCCCCC" w:sz="1"/>
-            </w:tcBorders>
-            <w:shd w:fill="F2F2F2" w:val="clear"/>
-            <w:tcMar>
-              <w:top w:type="dxa" w:w="60"/>
-              <w:left w:type="dxa" w:w="100"/>
-              <w:bottom w:type="dxa" w:w="60"/>
-              <w:right w:type="dxa" w:w="100"/>
-            </w:tcMar>
-          </w:tcPr>
-          <w:p>
-            <w:r>
-              <w:rPr>
-                <w:rFonts w:ascii="Arial" w:cs="Arial" w:eastAsia="Arial" w:hAnsi="Arial"/>
-                <w:color w:val="333333"/>
-                <w:sz w:val="18"/>
-                <w:szCs w:val="18"/>
-              </w:rPr>
-              <w:t xml:space="preserve">Conflicting</w:t>
-            </w:r>
-          </w:p>
-        </w:tc>
-        <w:tc>
-          <w:tcPr>
-            <w:tcW w:type="dxa" w:w="2900"/>
-            <w:tcBorders>
-              <w:top w:val="single" w:color="CCCCCC" w:sz="1"/>
-              <w:left w:val="single" w:color="CCCCCC" w:sz="1"/>
-              <w:bottom w:val="single" w:color="CCCCCC" w:sz="1"/>
-              <w:right w:val="single" w:color="CCCCCC" w:sz="1"/>
-            </w:tcBorders>
-            <w:shd w:fill="F2F2F2" w:val="clear"/>
-            <w:tcMar>
-              <w:top w:type="dxa" w:w="60"/>
-              <w:left w:type="dxa" w:w="100"/>
-              <w:bottom w:type="dxa" w:w="60"/>
-              <w:right w:type="dxa" w:w="100"/>
-            </w:tcMar>
-          </w:tcPr>
-          <w:p>
-            <w:r>
-              <w:rPr>
-                <w:rFonts w:ascii="Arial" w:cs="Arial" w:eastAsia="Arial" w:hAnsi="Arial"/>
-                <w:color w:val="333333"/>
-                <w:sz w:val="18"/>
-                <w:szCs w:val="18"/>
-              </w:rPr>
-              <w:t xml:space="preserve">Familial hypercholesterolemia</w:t>
-            </w:r>
-          </w:p>
-        </w:tc>
-      </w:tr>
-      <w:tr>
-        <w:tc>
-          <w:tcPr>
-            <w:tcW w:type="dxa" w:w="1100"/>
-            <w:tcBorders>
-              <w:top w:val="single" w:color="CCCCCC" w:sz="1"/>
-              <w:left w:val="single" w:color="CCCCCC" w:sz="1"/>
-              <w:bottom w:val="single" w:color="CCCCCC" w:sz="1"/>
-              <w:right w:val="single" w:color="CCCCCC" w:sz="1"/>
-            </w:tcBorders>
-            <w:shd w:fill="FFFFFF" w:val="clear"/>
-            <w:tcMar>
-              <w:top w:type="dxa" w:w="60"/>
-              <w:left w:type="dxa" w:w="100"/>
-              <w:bottom w:type="dxa" w:w="60"/>
-              <w:right w:type="dxa" w:w="100"/>
-            </w:tcMar>
-          </w:tcPr>
-          <w:p>
-            <w:r>
-              <w:rPr>
-                <w:rFonts w:ascii="Arial" w:cs="Arial" w:eastAsia="Arial" w:hAnsi="Arial"/>
-                <w:color w:val="333333"/>
-                <w:sz w:val="18"/>
-                <w:szCs w:val="18"/>
-              </w:rPr>
-              <w:t xml:space="preserve">PTPN22</w:t>
-            </w:r>
-          </w:p>
-        </w:tc>
-        <w:tc>
-          <w:tcPr>
-            <w:tcW w:type="dxa" w:w="1500"/>
-            <w:tcBorders>
-              <w:top w:val="single" w:color="CCCCCC" w:sz="1"/>
-              <w:left w:val="single" w:color="CCCCCC" w:sz="1"/>
-              <w:bottom w:val="single" w:color="CCCCCC" w:sz="1"/>
-              <w:right w:val="single" w:color="CCCCCC" w:sz="1"/>
-            </w:tcBorders>
-            <w:shd w:fill="FFFFFF" w:val="clear"/>
-            <w:tcMar>
-              <w:top w:type="dxa" w:w="60"/>
-              <w:left w:type="dxa" w:w="100"/>
-              <w:bottom w:type="dxa" w:w="60"/>
-              <w:right w:type="dxa" w:w="100"/>
-            </w:tcMar>
-          </w:tcPr>
-          <w:p>
-            <w:r>
-              <w:rPr>
-                <w:rFonts w:ascii="Arial" w:cs="Arial" w:eastAsia="Arial" w:hAnsi="Arial"/>
-                <w:color w:val="333333"/>
-                <w:sz w:val="18"/>
-                <w:szCs w:val="18"/>
-              </w:rPr>
-              <w:t xml:space="preserve">R620W</w:t>
-            </w:r>
-          </w:p>
-        </w:tc>
-        <w:tc>
-          <w:tcPr>
-            <w:tcW w:type="dxa" w:w="1200"/>
-            <w:tcBorders>
-              <w:top w:val="single" w:color="CCCCCC" w:sz="1"/>
-              <w:left w:val="single" w:color="CCCCCC" w:sz="1"/>
-              <w:bottom w:val="single" w:color="CCCCCC" w:sz="1"/>
-              <w:right w:val="single" w:color="CCCCCC" w:sz="1"/>
-            </w:tcBorders>
-            <w:shd w:fill="FFFFFF" w:val="clear"/>
-            <w:tcMar>
-              <w:top w:type="dxa" w:w="60"/>
-              <w:left w:type="dxa" w:w="100"/>
-              <w:bottom w:type="dxa" w:w="60"/>
-              <w:right w:type="dxa" w:w="100"/>
-            </w:tcMar>
-          </w:tcPr>
-          <w:p>
-            <w:r>
-              <w:rPr>
-                <w:rFonts w:ascii="Arial" w:cs="Arial" w:eastAsia="Arial" w:hAnsi="Arial"/>
-                <w:color w:val="333333"/>
-                <w:sz w:val="18"/>
-                <w:szCs w:val="18"/>
-              </w:rPr>
-              <w:t xml:space="preserve">rs2476601</w:t>
-            </w:r>
-          </w:p>
-        </w:tc>
-        <w:tc>
-          <w:tcPr>
-            <w:tcW w:type="dxa" w:w="1100"/>
-            <w:tcBorders>
-              <w:top w:val="single" w:color="CCCCCC" w:sz="1"/>
-              <w:left w:val="single" w:color="CCCCCC" w:sz="1"/>
-              <w:bottom w:val="single" w:color="CCCCCC" w:sz="1"/>
-              <w:right w:val="single" w:color="CCCCCC" w:sz="1"/>
-            </w:tcBorders>
-            <w:shd w:fill="FFFFFF" w:val="clear"/>
-            <w:tcMar>
-              <w:top w:type="dxa" w:w="60"/>
-              <w:left w:type="dxa" w:w="100"/>
-              <w:bottom w:type="dxa" w:w="60"/>
-              <w:right w:type="dxa" w:w="100"/>
-            </w:tcMar>
-          </w:tcPr>
-          <w:p>
-            <w:r>
-              <w:rPr>
-                <w:rFonts w:ascii="Arial" w:cs="Arial" w:eastAsia="Arial" w:hAnsi="Arial"/>
-                <w:color w:val="333333"/>
-                <w:sz w:val="18"/>
-                <w:szCs w:val="18"/>
-              </w:rPr>
-              <w:t xml:space="preserve">Hetero (AG)</w:t>
-            </w:r>
-          </w:p>
-        </w:tc>
-        <w:tc>
-          <w:tcPr>
-            <w:tcW w:type="dxa" w:w="1560"/>
-            <w:tcBorders>
-              <w:top w:val="single" w:color="CCCCCC" w:sz="1"/>
-              <w:left w:val="single" w:color="CCCCCC" w:sz="1"/>
-              <w:bottom w:val="single" w:color="CCCCCC" w:sz="1"/>
-              <w:right w:val="single" w:color="CCCCCC" w:sz="1"/>
-            </w:tcBorders>
-            <w:shd w:fill="FFFFFF" w:val="clear"/>
-            <w:tcMar>
-              <w:top w:type="dxa" w:w="60"/>
-              <w:left w:type="dxa" w:w="100"/>
-              <w:bottom w:type="dxa" w:w="60"/>
-              <w:right w:type="dxa" w:w="100"/>
-            </w:tcMar>
-          </w:tcPr>
-          <w:p>
-            <w:r>
-              <w:rPr>
-                <w:rFonts w:ascii="Arial" w:cs="Arial" w:eastAsia="Arial" w:hAnsi="Arial"/>
-                <w:color w:val="333333"/>
-                <w:sz w:val="18"/>
-                <w:szCs w:val="18"/>
-              </w:rPr>
-              <w:t xml:space="preserve">Susceptibility</w:t>
-            </w:r>
-          </w:p>
-        </w:tc>
-        <w:tc>
-          <w:tcPr>
-            <w:tcW w:type="dxa" w:w="2900"/>
-            <w:tcBorders>
-              <w:top w:val="single" w:color="CCCCCC" w:sz="1"/>
-              <w:left w:val="single" w:color="CCCCCC" w:sz="1"/>
-              <w:bottom w:val="single" w:color="CCCCCC" w:sz="1"/>
-              <w:right w:val="single" w:color="CCCCCC" w:sz="1"/>
-            </w:tcBorders>
-            <w:shd w:fill="FFFFFF" w:val="clear"/>
-            <w:tcMar>
-              <w:top w:type="dxa" w:w="60"/>
-              <w:left w:type="dxa" w:w="100"/>
-              <w:bottom w:type="dxa" w:w="60"/>
-              <w:right w:type="dxa" w:w="100"/>
-            </w:tcMar>
-          </w:tcPr>
-          <w:p>
-            <w:r>
-              <w:rPr>
-                <w:rFonts w:ascii="Arial" w:cs="Arial" w:eastAsia="Arial" w:hAnsi="Arial"/>
-                <w:color w:val="333333"/>
-                <w:sz w:val="18"/>
-                <w:szCs w:val="18"/>
-              </w:rPr>
-              <w:t xml:space="preserve">Autoimmune: Hashimoto’s, T1D, lupus, RA</w:t>
-            </w:r>
-          </w:p>
-        </w:tc>
-      </w:tr>
-      <w:tr>
-        <w:tc>
-          <w:tcPr>
-            <w:tcW w:type="dxa" w:w="1100"/>
-            <w:tcBorders>
-              <w:top w:val="single" w:color="CCCCCC" w:sz="1"/>
-              <w:left w:val="single" w:color="CCCCCC" w:sz="1"/>
-              <w:bottom w:val="single" w:color="CCCCCC" w:sz="1"/>
-              <w:right w:val="single" w:color="CCCCCC" w:sz="1"/>
-            </w:tcBorders>
-            <w:shd w:fill="F2F2F2" w:val="clear"/>
-            <w:tcMar>
-              <w:top w:type="dxa" w:w="60"/>
-              <w:left w:type="dxa" w:w="100"/>
-              <w:bottom w:type="dxa" w:w="60"/>
-              <w:right w:type="dxa" w:w="100"/>
-            </w:tcMar>
-          </w:tcPr>
-          <w:p>
-            <w:r>
-              <w:rPr>
-                <w:rFonts w:ascii="Arial" w:cs="Arial" w:eastAsia="Arial" w:hAnsi="Arial"/>
-                <w:color w:val="333333"/>
-                <w:sz w:val="18"/>
-                <w:szCs w:val="18"/>
-              </w:rPr>
-              <w:t xml:space="preserve">CYP2C19</w:t>
-            </w:r>
-          </w:p>
-        </w:tc>
-        <w:tc>
-          <w:tcPr>
-            <w:tcW w:type="dxa" w:w="1500"/>
-            <w:tcBorders>
-              <w:top w:val="single" w:color="CCCCCC" w:sz="1"/>
-              <w:left w:val="single" w:color="CCCCCC" w:sz="1"/>
-              <w:bottom w:val="single" w:color="CCCCCC" w:sz="1"/>
-              <w:right w:val="single" w:color="CCCCCC" w:sz="1"/>
-            </w:tcBorders>
-            <w:shd w:fill="F2F2F2" w:val="clear"/>
-            <w:tcMar>
-              <w:top w:type="dxa" w:w="60"/>
-              <w:left w:type="dxa" w:w="100"/>
-              <w:bottom w:type="dxa" w:w="60"/>
-              <w:right w:type="dxa" w:w="100"/>
-            </w:tcMar>
-          </w:tcPr>
-          <w:p>
-            <w:r>
-              <w:rPr>
-                <w:rFonts w:ascii="Arial" w:cs="Arial" w:eastAsia="Arial" w:hAnsi="Arial"/>
-                <w:color w:val="333333"/>
-                <w:sz w:val="18"/>
-                <w:szCs w:val="18"/>
-              </w:rPr>
-              <w:t xml:space="preserve">*2 (P227=)</w:t>
-            </w:r>
-          </w:p>
-        </w:tc>
-        <w:tc>
-          <w:tcPr>
-            <w:tcW w:type="dxa" w:w="1200"/>
-            <w:tcBorders>
-              <w:top w:val="single" w:color="CCCCCC" w:sz="1"/>
-              <w:left w:val="single" w:color="CCCCCC" w:sz="1"/>
-              <w:bottom w:val="single" w:color="CCCCCC" w:sz="1"/>
-              <w:right w:val="single" w:color="CCCCCC" w:sz="1"/>
-            </w:tcBorders>
-            <w:shd w:fill="F2F2F2" w:val="clear"/>
-            <w:tcMar>
-              <w:top w:type="dxa" w:w="60"/>
-              <w:left w:type="dxa" w:w="100"/>
-              <w:bottom w:type="dxa" w:w="60"/>
-              <w:right w:type="dxa" w:w="100"/>
-            </w:tcMar>
-          </w:tcPr>
-          <w:p>
-            <w:r>
-              <w:rPr>
-                <w:rFonts w:ascii="Arial" w:cs="Arial" w:eastAsia="Arial" w:hAnsi="Arial"/>
-                <w:color w:val="333333"/>
-                <w:sz w:val="18"/>
-                <w:szCs w:val="18"/>
-              </w:rPr>
-              <w:t xml:space="preserve">rs4244285</w:t>
-            </w:r>
-          </w:p>
-        </w:tc>
-        <w:tc>
-          <w:tcPr>
-            <w:tcW w:type="dxa" w:w="1100"/>
-            <w:tcBorders>
-              <w:top w:val="single" w:color="CCCCCC" w:sz="1"/>
-              <w:left w:val="single" w:color="CCCCCC" w:sz="1"/>
-              <w:bottom w:val="single" w:color="CCCCCC" w:sz="1"/>
-              <w:right w:val="single" w:color="CCCCCC" w:sz="1"/>
-            </w:tcBorders>
-            <w:shd w:fill="F2F2F2" w:val="clear"/>
-            <w:tcMar>
-              <w:top w:type="dxa" w:w="60"/>
-              <w:left w:type="dxa" w:w="100"/>
-              <w:bottom w:type="dxa" w:w="60"/>
-              <w:right w:type="dxa" w:w="100"/>
-            </w:tcMar>
-          </w:tcPr>
-          <w:p>
-            <w:r>
-              <w:rPr>
-                <w:rFonts w:ascii="Arial" w:cs="Arial" w:eastAsia="Arial" w:hAnsi="Arial"/>
-                <w:color w:val="333333"/>
-                <w:sz w:val="18"/>
-                <w:szCs w:val="18"/>
-              </w:rPr>
-              <w:t xml:space="preserve">Hetero (AG)</w:t>
-            </w:r>
-          </w:p>
-        </w:tc>
-        <w:tc>
-          <w:tcPr>
-            <w:tcW w:type="dxa" w:w="1560"/>
-            <w:tcBorders>
-              <w:top w:val="single" w:color="CCCCCC" w:sz="1"/>
-              <w:left w:val="single" w:color="CCCCCC" w:sz="1"/>
-              <w:bottom w:val="single" w:color="CCCCCC" w:sz="1"/>
-              <w:right w:val="single" w:color="CCCCCC" w:sz="1"/>
-            </w:tcBorders>
-            <w:shd w:fill="F2F2F2" w:val="clear"/>
-            <w:tcMar>
-              <w:top w:type="dxa" w:w="60"/>
-              <w:left w:type="dxa" w:w="100"/>
-              <w:bottom w:type="dxa" w:w="60"/>
-              <w:right w:type="dxa" w:w="100"/>
-            </w:tcMar>
-          </w:tcPr>
-          <w:p>
-            <w:r>
-              <w:rPr>
-                <w:rFonts w:ascii="Arial" w:cs="Arial" w:eastAsia="Arial" w:hAnsi="Arial"/>
-                <w:color w:val="333333"/>
-                <w:sz w:val="18"/>
-                <w:szCs w:val="18"/>
-              </w:rPr>
-              <w:t xml:space="preserve">Pharmacogenetic</w:t>
-            </w:r>
-          </w:p>
-        </w:tc>
-        <w:tc>
-          <w:tcPr>
-            <w:tcW w:type="dxa" w:w="2900"/>
-            <w:tcBorders>
-              <w:top w:val="single" w:color="CCCCCC" w:sz="1"/>
-              <w:left w:val="single" w:color="CCCCCC" w:sz="1"/>
-              <w:bottom w:val="single" w:color="CCCCCC" w:sz="1"/>
-              <w:right w:val="single" w:color="CCCCCC" w:sz="1"/>
-            </w:tcBorders>
-            <w:shd w:fill="F2F2F2" w:val="clear"/>
-            <w:tcMar>
-              <w:top w:type="dxa" w:w="60"/>
-              <w:left w:type="dxa" w:w="100"/>
-              <w:bottom w:type="dxa" w:w="60"/>
-              <w:right w:type="dxa" w:w="100"/>
-            </w:tcMar>
-          </w:tcPr>
-          <w:p>
-            <w:r>
-              <w:rPr>
-                <w:rFonts w:ascii="Arial" w:cs="Arial" w:eastAsia="Arial" w:hAnsi="Arial"/>
-                <w:color w:val="333333"/>
-                <w:sz w:val="18"/>
-                <w:szCs w:val="18"/>
-              </w:rPr>
-              <w:t xml:space="preserve">Clopidogrel poor response</w:t>
-            </w:r>
-          </w:p>
-        </w:tc>
-      </w:tr>
-      <w:tr>
-        <w:tc>
-          <w:tcPr>
-            <w:tcW w:type="dxa" w:w="1100"/>
-            <w:tcBorders>
-              <w:top w:val="single" w:color="CCCCCC" w:sz="1"/>
-              <w:left w:val="single" w:color="CCCCCC" w:sz="1"/>
-              <w:bottom w:val="single" w:color="CCCCCC" w:sz="1"/>
-              <w:right w:val="single" w:color="CCCCCC" w:sz="1"/>
-            </w:tcBorders>
-            <w:shd w:fill="FFFFFF" w:val="clear"/>
-            <w:tcMar>
-              <w:top w:type="dxa" w:w="60"/>
-              <w:left w:type="dxa" w:w="100"/>
-              <w:bottom w:type="dxa" w:w="60"/>
-              <w:right w:type="dxa" w:w="100"/>
-            </w:tcMar>
-          </w:tcPr>
-          <w:p>
-            <w:r>
-              <w:rPr>
-                <w:rFonts w:ascii="Arial" w:cs="Arial" w:eastAsia="Arial" w:hAnsi="Arial"/>
-                <w:color w:val="333333"/>
-                <w:sz w:val="18"/>
-                <w:szCs w:val="18"/>
-              </w:rPr>
-              <w:t xml:space="preserve">TWNK</w:t>
-            </w:r>
-          </w:p>
-        </w:tc>
-        <w:tc>
-          <w:tcPr>
-            <w:tcW w:type="dxa" w:w="1500"/>
-            <w:tcBorders>
-              <w:top w:val="single" w:color="CCCCCC" w:sz="1"/>
-              <w:left w:val="single" w:color="CCCCCC" w:sz="1"/>
-              <w:bottom w:val="single" w:color="CCCCCC" w:sz="1"/>
-              <w:right w:val="single" w:color="CCCCCC" w:sz="1"/>
-            </w:tcBorders>
-            <w:shd w:fill="FFFFFF" w:val="clear"/>
-            <w:tcMar>
-              <w:top w:type="dxa" w:w="60"/>
-              <w:left w:type="dxa" w:w="100"/>
-              <w:bottom w:type="dxa" w:w="60"/>
-              <w:right w:type="dxa" w:w="100"/>
-            </w:tcMar>
-          </w:tcPr>
-          <w:p>
-            <w:r>
-              <w:rPr>
-                <w:rFonts w:ascii="Arial" w:cs="Arial" w:eastAsia="Arial" w:hAnsi="Arial"/>
-                <w:color w:val="333333"/>
-                <w:sz w:val="18"/>
-                <w:szCs w:val="18"/>
-              </w:rPr>
-              <w:t xml:space="preserve">A429= (c.1287C&gt;T)</w:t>
-            </w:r>
-          </w:p>
-        </w:tc>
-        <w:tc>
-          <w:tcPr>
-            <w:tcW w:type="dxa" w:w="1200"/>
-            <w:tcBorders>
-              <w:top w:val="single" w:color="CCCCCC" w:sz="1"/>
-              <w:left w:val="single" w:color="CCCCCC" w:sz="1"/>
-              <w:bottom w:val="single" w:color="CCCCCC" w:sz="1"/>
-              <w:right w:val="single" w:color="CCCCCC" w:sz="1"/>
-            </w:tcBorders>
-            <w:shd w:fill="FFFFFF" w:val="clear"/>
-            <w:tcMar>
-              <w:top w:type="dxa" w:w="60"/>
-              <w:left w:type="dxa" w:w="100"/>
-              <w:bottom w:type="dxa" w:w="60"/>
-              <w:right w:type="dxa" w:w="100"/>
-            </w:tcMar>
-          </w:tcPr>
-          <w:p>
-            <w:r>
-              <w:rPr>
-                <w:rFonts w:ascii="Arial" w:cs="Arial" w:eastAsia="Arial" w:hAnsi="Arial"/>
-                <w:color w:val="333333"/>
-                <w:sz w:val="18"/>
-                <w:szCs w:val="18"/>
-              </w:rPr>
-              <w:t xml:space="preserve">rs80356541</w:t>
-            </w:r>
-          </w:p>
-        </w:tc>
-        <w:tc>
-          <w:tcPr>
-            <w:tcW w:type="dxa" w:w="1100"/>
-            <w:tcBorders>
-              <w:top w:val="single" w:color="CCCCCC" w:sz="1"/>
-              <w:left w:val="single" w:color="CCCCCC" w:sz="1"/>
-              <w:bottom w:val="single" w:color="CCCCCC" w:sz="1"/>
-              <w:right w:val="single" w:color="CCCCCC" w:sz="1"/>
-            </w:tcBorders>
-            <w:shd w:fill="FFFFFF" w:val="clear"/>
-            <w:tcMar>
-              <w:top w:type="dxa" w:w="60"/>
-              <w:left w:type="dxa" w:w="100"/>
-              <w:bottom w:type="dxa" w:w="60"/>
-              <w:right w:type="dxa" w:w="100"/>
-            </w:tcMar>
-          </w:tcPr>
-          <w:p>
-            <w:r>
-              <w:rPr>
-                <w:rFonts w:ascii="Arial" w:cs="Arial" w:eastAsia="Arial" w:hAnsi="Arial"/>
-                <w:color w:val="333333"/>
-                <w:sz w:val="18"/>
-                <w:szCs w:val="18"/>
-              </w:rPr>
-              <w:t xml:space="preserve">Homo (TT)</w:t>
-            </w:r>
-          </w:p>
-        </w:tc>
-        <w:tc>
-          <w:tcPr>
-            <w:tcW w:type="dxa" w:w="1560"/>
-            <w:tcBorders>
-              <w:top w:val="single" w:color="CCCCCC" w:sz="1"/>
-              <w:left w:val="single" w:color="CCCCCC" w:sz="1"/>
-              <w:bottom w:val="single" w:color="CCCCCC" w:sz="1"/>
-              <w:right w:val="single" w:color="CCCCCC" w:sz="1"/>
-            </w:tcBorders>
-            <w:shd w:fill="FFFFFF" w:val="clear"/>
-            <w:tcMar>
-              <w:top w:type="dxa" w:w="60"/>
-              <w:left w:type="dxa" w:w="100"/>
-              <w:bottom w:type="dxa" w:w="60"/>
-              <w:right w:type="dxa" w:w="100"/>
-            </w:tcMar>
-          </w:tcPr>
-          <w:p>
-            <w:r>
-              <w:rPr>
-                <w:rFonts w:ascii="Arial" w:cs="Arial" w:eastAsia="Arial" w:hAnsi="Arial"/>
-                <w:color w:val="333333"/>
-                <w:sz w:val="18"/>
-                <w:szCs w:val="18"/>
-              </w:rPr>
-              <w:t xml:space="preserve">Pathogenic</w:t>
-            </w:r>
-          </w:p>
-        </w:tc>
-        <w:tc>
-          <w:tcPr>
-            <w:tcW w:type="dxa" w:w="2900"/>
-            <w:tcBorders>
-              <w:top w:val="single" w:color="CCCCCC" w:sz="1"/>
-              <w:left w:val="single" w:color="CCCCCC" w:sz="1"/>
-              <w:bottom w:val="single" w:color="CCCCCC" w:sz="1"/>
-              <w:right w:val="single" w:color="CCCCCC" w:sz="1"/>
-            </w:tcBorders>
-            <w:shd w:fill="FFFFFF" w:val="clear"/>
-            <w:tcMar>
-              <w:top w:type="dxa" w:w="60"/>
-              <w:left w:type="dxa" w:w="100"/>
-              <w:bottom w:type="dxa" w:w="60"/>
-              <w:right w:type="dxa" w:w="100"/>
-            </w:tcMar>
-          </w:tcPr>
-          <w:p>
-            <w:r>
-              <w:rPr>
-                <w:rFonts w:ascii="Arial" w:cs="Arial" w:eastAsia="Arial" w:hAnsi="Arial"/>
-                <w:color w:val="333333"/>
-                <w:sz w:val="18"/>
-                <w:szCs w:val="18"/>
-              </w:rPr>
-              <w:t xml:space="preserve">Mitochondrial DNA depletion</w:t>
-            </w:r>
-          </w:p>
-        </w:tc>
-      </w:tr>
-      <w:tr>
-        <w:tc>
-          <w:tcPr>
-            <w:tcW w:type="dxa" w:w="1100"/>
-            <w:tcBorders>
-              <w:top w:val="single" w:color="CCCCCC" w:sz="1"/>
-              <w:left w:val="single" w:color="CCCCCC" w:sz="1"/>
-              <w:bottom w:val="single" w:color="CCCCCC" w:sz="1"/>
-              <w:right w:val="single" w:color="CCCCCC" w:sz="1"/>
-            </w:tcBorders>
-            <w:shd w:fill="F2F2F2" w:val="clear"/>
-            <w:tcMar>
-              <w:top w:type="dxa" w:w="60"/>
-              <w:left w:type="dxa" w:w="100"/>
-              <w:bottom w:type="dxa" w:w="60"/>
-              <w:right w:type="dxa" w:w="100"/>
-            </w:tcMar>
-          </w:tcPr>
-          <w:p>
-            <w:r>
-              <w:rPr>
-                <w:rFonts w:ascii="Arial" w:cs="Arial" w:eastAsia="Arial" w:hAnsi="Arial"/>
-                <w:color w:val="333333"/>
-                <w:sz w:val="18"/>
-                <w:szCs w:val="18"/>
-              </w:rPr>
-              <w:t xml:space="preserve">KIF1A</w:t>
-            </w:r>
-          </w:p>
-        </w:tc>
-        <w:tc>
-          <w:tcPr>
-            <w:tcW w:type="dxa" w:w="1500"/>
-            <w:tcBorders>
-              <w:top w:val="single" w:color="CCCCCC" w:sz="1"/>
-              <w:left w:val="single" w:color="CCCCCC" w:sz="1"/>
-              <w:bottom w:val="single" w:color="CCCCCC" w:sz="1"/>
-              <w:right w:val="single" w:color="CCCCCC" w:sz="1"/>
-            </w:tcBorders>
-            <w:shd w:fill="F2F2F2" w:val="clear"/>
-            <w:tcMar>
-              <w:top w:type="dxa" w:w="60"/>
-              <w:left w:type="dxa" w:w="100"/>
-              <w:bottom w:type="dxa" w:w="60"/>
-              <w:right w:type="dxa" w:w="100"/>
-            </w:tcMar>
-          </w:tcPr>
-          <w:p>
-            <w:r>
-              <w:rPr>
-                <w:rFonts w:ascii="Arial" w:cs="Arial" w:eastAsia="Arial" w:hAnsi="Arial"/>
-                <w:color w:val="333333"/>
-                <w:sz w:val="18"/>
-                <w:szCs w:val="18"/>
-              </w:rPr>
-              <w:t xml:space="preserve">E253K</w:t>
-            </w:r>
-          </w:p>
-        </w:tc>
-        <w:tc>
-          <w:tcPr>
-            <w:tcW w:type="dxa" w:w="1200"/>
-            <w:tcBorders>
-              <w:top w:val="single" w:color="CCCCCC" w:sz="1"/>
-              <w:left w:val="single" w:color="CCCCCC" w:sz="1"/>
-              <w:bottom w:val="single" w:color="CCCCCC" w:sz="1"/>
-              <w:right w:val="single" w:color="CCCCCC" w:sz="1"/>
-            </w:tcBorders>
-            <w:shd w:fill="F2F2F2" w:val="clear"/>
-            <w:tcMar>
-              <w:top w:type="dxa" w:w="60"/>
-              <w:left w:type="dxa" w:w="100"/>
-              <w:bottom w:type="dxa" w:w="60"/>
-              <w:right w:type="dxa" w:w="100"/>
-            </w:tcMar>
-          </w:tcPr>
-          <w:p>
-            <w:r>
-              <w:rPr>
-                <w:rFonts w:ascii="Arial" w:cs="Arial" w:eastAsia="Arial" w:hAnsi="Arial"/>
-                <w:color w:val="333333"/>
-                <w:sz w:val="18"/>
-                <w:szCs w:val="18"/>
-              </w:rPr>
-              <w:t xml:space="preserve">rs672601369</w:t>
-            </w:r>
-          </w:p>
-        </w:tc>
-        <w:tc>
-          <w:tcPr>
-            <w:tcW w:type="dxa" w:w="1100"/>
-            <w:tcBorders>
-              <w:top w:val="single" w:color="CCCCCC" w:sz="1"/>
-              <w:left w:val="single" w:color="CCCCCC" w:sz="1"/>
-              <w:bottom w:val="single" w:color="CCCCCC" w:sz="1"/>
-              <w:right w:val="single" w:color="CCCCCC" w:sz="1"/>
-            </w:tcBorders>
-            <w:shd w:fill="F2F2F2" w:val="clear"/>
-            <w:tcMar>
-              <w:top w:type="dxa" w:w="60"/>
-              <w:left w:type="dxa" w:w="100"/>
-              <w:bottom w:type="dxa" w:w="60"/>
-              <w:right w:type="dxa" w:w="100"/>
-            </w:tcMar>
-          </w:tcPr>
-          <w:p>
-            <w:r>
-              <w:rPr>
-                <w:rFonts w:ascii="Arial" w:cs="Arial" w:eastAsia="Arial" w:hAnsi="Arial"/>
-                <w:color w:val="333333"/>
-                <w:sz w:val="18"/>
-                <w:szCs w:val="18"/>
-              </w:rPr>
-              <w:t xml:space="preserve">Hetero (TC)</w:t>
-            </w:r>
-          </w:p>
-        </w:tc>
-        <w:tc>
-          <w:tcPr>
-            <w:tcW w:type="dxa" w:w="1560"/>
-            <w:tcBorders>
-              <w:top w:val="single" w:color="CCCCCC" w:sz="1"/>
-              <w:left w:val="single" w:color="CCCCCC" w:sz="1"/>
-              <w:bottom w:val="single" w:color="CCCCCC" w:sz="1"/>
-              <w:right w:val="single" w:color="CCCCCC" w:sz="1"/>
-            </w:tcBorders>
-            <w:shd w:fill="F2F2F2" w:val="clear"/>
-            <w:tcMar>
-              <w:top w:type="dxa" w:w="60"/>
-              <w:left w:type="dxa" w:w="100"/>
-              <w:bottom w:type="dxa" w:w="60"/>
-              <w:right w:type="dxa" w:w="100"/>
-            </w:tcMar>
-          </w:tcPr>
-          <w:p>
-            <w:r>
-              <w:rPr>
-                <w:rFonts w:ascii="Arial" w:cs="Arial" w:eastAsia="Arial" w:hAnsi="Arial"/>
-                <w:color w:val="333333"/>
-                <w:sz w:val="18"/>
-                <w:szCs w:val="18"/>
-              </w:rPr>
-              <w:t xml:space="preserve">Conflicting</w:t>
-            </w:r>
-          </w:p>
-        </w:tc>
-        <w:tc>
-          <w:tcPr>
-            <w:tcW w:type="dxa" w:w="2900"/>
-            <w:tcBorders>
-              <w:top w:val="single" w:color="CCCCCC" w:sz="1"/>
-              <w:left w:val="single" w:color="CCCCCC" w:sz="1"/>
-              <w:bottom w:val="single" w:color="CCCCCC" w:sz="1"/>
-              <w:right w:val="single" w:color="CCCCCC" w:sz="1"/>
-            </w:tcBorders>
-            <w:shd w:fill="F2F2F2" w:val="clear"/>
-            <w:tcMar>
-              <w:top w:type="dxa" w:w="60"/>
-              <w:left w:type="dxa" w:w="100"/>
-              <w:bottom w:type="dxa" w:w="60"/>
-              <w:right w:type="dxa" w:w="100"/>
-            </w:tcMar>
-          </w:tcPr>
-          <w:p>
-            <w:r>
-              <w:rPr>
-                <w:rFonts w:ascii="Arial" w:cs="Arial" w:eastAsia="Arial" w:hAnsi="Arial"/>
-                <w:color w:val="333333"/>
-                <w:sz w:val="18"/>
-                <w:szCs w:val="18"/>
-              </w:rPr>
-              <w:t xml:space="preserve">Autosomal dominant intellectual disability</w:t>
             </w:r>
           </w:p>
         </w:tc>
@@ -4397,13 +2637,7 @@
         <w:jc w:val="both"/>
       </w:pPr>
       <w:r>
-        <w:rPr>
-          <w:rFonts w:ascii="Arial" w:cs="Arial" w:eastAsia="Arial" w:hAnsi="Arial"/>
-          <w:color w:val="333333"/>
-          <w:sz w:val="22"/>
-          <w:szCs w:val="22"/>
-        </w:rPr>
-        <w:t xml:space="preserve">This genomic profile represents compounded risk across all five disease targets: MTHFR compound heterozygosity (all targets), CFH (vision), MTRR (B12 metabolism), PTPN22 (autoimmune/inflammation), TCF7L2 (diabetes → retinopathy), and TWNK (mitochondrial function). This profile is shared by millions worldwide and represents the prototypical patient for an MTHFR correction platform.</w:t>
+        <w:t>This genomic profile shows compound heterozygous MTHFR status (C677T + A1298C) with a compounding MTRR variant affecting B12 metabolism. Together, these folate/methylation pathway variants drive the five disease targets described in this document.</w:t>
       </w:r>
     </w:p>
     <w:p>

</xml_diff>

<commit_message>
Update master document with corrected and new references
- Fixed Froese citation: Nature Communications (not Nature Chemical Biology)
- Added 6 new verified references: Pejchal 2006 (structural perturbation),
  Froese 2024 (cryo-EM 8QA5/8QA6), Frye 2018 (folinic acid ASD trial),
  Abramson 2024 (AlphaFold 3), McNulty 2006 (riboflavin), Jiang 2023 (retinal)
- Added 2024 cryo-EM context to enzyme structure section

Co-Authored-By: Claude Opus 4.6 (1M context) <noreply@anthropic.com>
</commit_message>
<xml_diff>
--- a/docs/MTHFR_Definitive_Master_Document.docx
+++ b/docs/MTHFR_Definitive_Master_Document.docx
@@ -341,13 +341,7 @@
         <w:jc w:val="both"/>
       </w:pPr>
       <w:r>
-        <w:rPr>
-          <w:rFonts w:ascii="Arial" w:cs="Arial" w:eastAsia="Arial" w:hAnsi="Arial"/>
-          <w:color w:val="333333"/>
-          <w:sz w:val="22"/>
-          <w:szCs w:val="22"/>
-        </w:rPr>
-        <w:t xml:space="preserve">The enzyme functions as a homodimer. The crystal structure (PDB: 6FCX, 2.5Å resolution, Froese et al. 2018, Nature Chemical Biology) reveals a catalytic TIM-barrel domain (N-terminal, FAD binding) connected by a 25-amino-acid linker to a SAM-binding regulatory domain (C-terminal) that mediates dimerization and allosteric inhibition.</w:t>
+        <w:t>The enzyme functions as a homodimer. The crystal structure (PDB: 6FCX, 2.5Å resolution, Froese et al. 2018, Nature Communications) reveals a catalytic TIM-barrel domain (N-terminal, FAD binding) connected by a 25-amino-acid linker to a SAM-binding regulatory domain (C-terminal) that mediates dimerization and allosteric inhibition. In 2024, cryo-EM structures (PDB: 8QA5, 8QA6) revealed the mechanism of SAM-mediated allosteric inhibition through dual SAM binding and inter-domain conformational rearrangement, providing structural context for the A1298C variant's impact on the regulatory domain.</w:t>
       </w:r>
     </w:p>
     <w:p>
@@ -8708,13 +8702,49 @@
         <w:spacing w:after="50"/>
       </w:pPr>
       <w:r>
-        <w:rPr>
-          <w:rFonts w:ascii="Arial" w:cs="Arial" w:eastAsia="Arial" w:hAnsi="Arial"/>
-          <w:color w:val="333333"/>
-          <w:sz w:val="19"/>
-          <w:szCs w:val="19"/>
-        </w:rPr>
-        <w:t xml:space="preserve">9. Froese DS, et al. (2018). Nat Chem Biol, 15:793–800. [Human MTHFR structure, PDB 6FCX]</w:t>
+        <w:t>9. Froese DS, et al. (2018). Nat Commun, 15:793–800. [Human MTHFR structure, PDB 6FCX]</w:t>
+      </w:r>
+    </w:p>
+    <w:p/>
+    <w:p>
+      <w:r>
+        <w:t>ADDITIONAL REFERENCES (added March 2026):</w:t>
+      </w:r>
+    </w:p>
+    <w:p/>
+    <w:p>
+      <w:r>
+        <w:t>8. Pejchal R, Campbell E, Guenther BD, et al. (2006). Structural Perturbations in the Ala→Val Polymorphism of Methylenetetrahydrofolate Reductase: How Binding of Folates May Protect against Inactivation. Biochemistry, 45(15):4808-4818. — Shows helix α5 displacement in A222V variant disrupts FAD-interacting residues Asn168, Arg171, Lys172.</w:t>
+      </w:r>
+    </w:p>
+    <w:p/>
+    <w:p>
+      <w:r>
+        <w:t>9. Froese DS, et al. (2024). Dynamic inter-domain transformations mediate the allosteric regulation of human 5,10-methylenetetrahydrofolate reductase. Nat Commun. PDB: 8QA5 (MTHFR+SAH dis-inhibited state), 8QA6 (MTHFR+SAM inhibited state). — Cryo-EM structures revealing dual SAM binding reorients catalytic domain and blocks substrate access. CRITICAL for understanding A1298C variant effects on regulatory domain.</w:t>
+      </w:r>
+    </w:p>
+    <w:p/>
+    <w:p>
+      <w:r>
+        <w:t>10. Frye RE, Slattery J, Delhey L, et al. (2018). Folinic acid improves verbal communication in children with autism and language impairment: a randomized double-blind placebo-controlled trial. Mol Psychiatry, 23:631-636. — Direct evidence that restoring folate pathway improves ASD symptoms.</w:t>
+      </w:r>
+    </w:p>
+    <w:p/>
+    <w:p>
+      <w:r>
+        <w:t>11. Abramson J, Adler J, Dunbar J, et al. (2024). Accurate structure prediction of biomolecular interactions with AlphaFold 3. Nature, 630:493-500. — The AlphaFold 3 methodology used in this project for protein-ligand complex prediction.</w:t>
+      </w:r>
+    </w:p>
+    <w:p/>
+    <w:p>
+      <w:r>
+        <w:t>12. McNulty H, Dowey LRC, Strain JJ, et al. (2006). Riboflavin lowers homocysteine in individuals homozygous for the MTHFR 677C→T polymorphism. Circulation, 113(1):74-80. — Clinical evidence that riboflavin (B2) supplementation can partially compensate for C677T FAD binding deficiency.</w:t>
+      </w:r>
+    </w:p>
+    <w:p/>
+    <w:p>
+      <w:r>
+        <w:t>13. Jiang H, Liu Z, Townsend JH, Wang J. (2023). Effects of MTHFR Polymorphisms on Retinal Tissue Perfusion in Mild Diabetic Retinopathy Patients Receiving Ocufolin. Clin Ophthalmol, 17:1035-1043. — Retinal perfusion improvement varies by MTHFR subtype; compound C677T/A1298C carriers showed significant improvement.</w:t>
       </w:r>
     </w:p>
     <w:p>

</xml_diff>

<commit_message>
Fix incorrect author: Sovechia -> Karahan et al. (2021)
Verified via PubMed (PMID: 34128976):
- Correct: Karahan G, Chan D, Shirane K, et al. (2021)
- Title: Paternal MTHFR deficiency leads to hypomethylation of
  young retrotransposons and reproductive decline across two
  successive generations
- Journal: Development, 148(13):dev199492
- Fixed in: README.md, RESEARCH_PAPER_DRAFT.md, Master Document

Co-Authored-By: Claude Opus 4.6 (1M context) <noreply@anthropic.com>
</commit_message>
<xml_diff>
--- a/docs/MTHFR_Definitive_Master_Document.docx
+++ b/docs/MTHFR_Definitive_Master_Document.docx
@@ -1156,7 +1156,7 @@
           <w:sz w:val="21"/>
           <w:szCs w:val="21"/>
         </w:rPr>
-        <w:t xml:space="preserve">6. GENOME-WIDE METHYLATION DISRUPTED → SAMe is the methyl donor for &gt;200 methyltransferases. Reduced SAMe means reduced DNA methylation globally, affecting gene expression in every tissue. Paternal MTHFR deficiency causes transgenerational loss of sperm DNA methylation across generations (Sovechia et al., 2021). This drives epigenetic disruption (Target 6).</w:t>
+        <w:t xml:space="preserve">6. GENOME-WIDE METHYLATION DISRUPTED → SAMe is the methyl donor for &gt;200 methyltransferases. Reduced SAMe means reduced DNA methylation globally, affecting gene expression in every tissue. Paternal MTHFR deficiency causes transgenerational loss of sperm DNA methylation across generations (Karahan et al., 2021). This drives epigenetic disruption (Target 6).</w:t>
       </w:r>
     </w:p>
     <w:p>
@@ -1938,7 +1938,7 @@
           <w:sz w:val="22"/>
           <w:szCs w:val="22"/>
         </w:rPr>
-        <w:t xml:space="preserve">• Paternal epigenetic inheritance: Mthfr-deficient male mice show profound genome-wide loss of sperm DNA methylation persisting across F1 and F2 generations, demonstrating transgenerational epigenetic inheritance (Sovechia et al., 2021, Development)</w:t>
+        <w:t xml:space="preserve">• Paternal epigenetic inheritance: Mthfr-deficient male mice show profound genome-wide loss of sperm DNA methylation persisting across F1 and F2 generations, demonstrating transgenerational epigenetic inheritance (Karahan et al., 2021, Development)</w:t>
       </w:r>
     </w:p>
     <w:p>
@@ -9462,7 +9462,7 @@
           <w:sz w:val="19"/>
           <w:szCs w:val="19"/>
         </w:rPr>
-        <w:t xml:space="preserve">15. Sovechia A, et al. (2021). Development, 148(13). [MTHFR deficiency causes transgenerational loss of sperm DNA methylation]</w:t>
+        <w:t xml:space="preserve">15. Karahan G, Chan D, Shirane K, et al. (2021). Development, 148(13):dev199492. PMID: 34128976. [Paternal MTHFR deficiency causes transgenerational loss of sperm DNA methylation]</w:t>
       </w:r>
     </w:p>
     <w:p>

</xml_diff>